<commit_message>
Actualizacion de informe y documentos teóricos
</commit_message>
<xml_diff>
--- a/DSP Completo.docx
+++ b/DSP Completo.docx
@@ -2507,23 +2507,7 @@
           <w:rFonts w:ascii="Arial" w:hAnsi="Arial" w:cs="Arial"/>
           <w:lang w:val="es-AR"/>
         </w:rPr>
-        <w:t xml:space="preserve">El prescaler se encarga de dividir la frecuencia del </w:t>
-      </w:r>
-      <w:proofErr w:type="spellStart"/>
-      <w:r>
-        <w:rPr>
-          <w:rFonts w:ascii="Arial" w:hAnsi="Arial" w:cs="Arial"/>
-          <w:lang w:val="es-AR"/>
-        </w:rPr>
-        <w:t>clock</w:t>
-      </w:r>
-      <w:proofErr w:type="spellEnd"/>
-      <w:r>
-        <w:rPr>
-          <w:rFonts w:ascii="Arial" w:hAnsi="Arial" w:cs="Arial"/>
-          <w:lang w:val="es-AR"/>
-        </w:rPr>
-        <w:t xml:space="preserve"> interno del microcontrolador (16MHz) por un valor de potencia de dos para bajar la frecuencia de medición y así que el conversor tenga tiempo de realizar la conversión de analógico a digital. Cabe aclarar que el prescaler máximo que se puede utilizar sin afectar el tiempo de conversión de </w:t>
+        <w:t xml:space="preserve">El prescaler se encarga de dividir la frecuencia del clock interno del microcontrolador (16MHz) por un valor de potencia de dos para bajar la frecuencia de medición y así que el conversor tenga tiempo de realizar la conversión de analógico a digital. Cabe aclarar que el prescaler máximo que se puede utilizar sin afectar el tiempo de conversión de </w:t>
       </w:r>
       <w:r>
         <w:rPr>
@@ -2829,23 +2813,7 @@
           <w:rFonts w:ascii="Arial" w:hAnsi="Arial" w:cs="Arial"/>
           <w:lang w:val="es-AR"/>
         </w:rPr>
-        <w:t xml:space="preserve">Modo de Conversión Única (Single </w:t>
-      </w:r>
-      <w:proofErr w:type="spellStart"/>
-      <w:r>
-        <w:rPr>
-          <w:rFonts w:ascii="Arial" w:hAnsi="Arial" w:cs="Arial"/>
-          <w:lang w:val="es-AR"/>
-        </w:rPr>
-        <w:t>Conversion</w:t>
-      </w:r>
-      <w:proofErr w:type="spellEnd"/>
-      <w:r>
-        <w:rPr>
-          <w:rFonts w:ascii="Arial" w:hAnsi="Arial" w:cs="Arial"/>
-          <w:lang w:val="es-AR"/>
-        </w:rPr>
-        <w:t xml:space="preserve"> Mode)</w:t>
+        <w:t>Modo de Conversión Única (Single Conversion Mode)</w:t>
       </w:r>
       <w:r>
         <w:rPr>
@@ -2925,39 +2893,7 @@
           <w:rFonts w:ascii="Arial" w:hAnsi="Arial" w:cs="Arial"/>
           <w:lang w:val="es-AR"/>
         </w:rPr>
-        <w:t xml:space="preserve">o </w:t>
-      </w:r>
-      <w:proofErr w:type="spellStart"/>
-      <w:r>
-        <w:rPr>
-          <w:rFonts w:ascii="Arial" w:hAnsi="Arial" w:cs="Arial"/>
-          <w:lang w:val="es-AR"/>
-        </w:rPr>
-        <w:t>Continuous</w:t>
-      </w:r>
-      <w:proofErr w:type="spellEnd"/>
-      <w:r>
-        <w:rPr>
-          <w:rFonts w:ascii="Arial" w:hAnsi="Arial" w:cs="Arial"/>
-          <w:lang w:val="es-AR"/>
-        </w:rPr>
-        <w:t xml:space="preserve"> </w:t>
-      </w:r>
-      <w:proofErr w:type="spellStart"/>
-      <w:r>
-        <w:rPr>
-          <w:rFonts w:ascii="Arial" w:hAnsi="Arial" w:cs="Arial"/>
-          <w:lang w:val="es-AR"/>
-        </w:rPr>
-        <w:t>Conversion</w:t>
-      </w:r>
-      <w:proofErr w:type="spellEnd"/>
-      <w:r>
-        <w:rPr>
-          <w:rFonts w:ascii="Arial" w:hAnsi="Arial" w:cs="Arial"/>
-          <w:lang w:val="es-AR"/>
-        </w:rPr>
-        <w:t xml:space="preserve"> Mode el ADC realiza conversiones continuamente a una velocidad determinada sin requerir solicitudes manuales.</w:t>
+        <w:t>o Continuous Conversion Mode el ADC realiza conversiones continuamente a una velocidad determinada sin requerir solicitudes manuales.</w:t>
       </w:r>
       <w:r>
         <w:rPr>
@@ -3440,20 +3376,12 @@
           <w:rFonts w:ascii="Arial" w:hAnsi="Arial" w:cs="Arial"/>
         </w:rPr>
       </w:pPr>
-      <w:proofErr w:type="spellStart"/>
       <w:r>
         <w:rPr>
           <w:rFonts w:ascii="Arial" w:hAnsi="Arial" w:cs="Arial"/>
         </w:rPr>
         <w:lastRenderedPageBreak/>
-        <w:t>Considerando</w:t>
-      </w:r>
-      <w:proofErr w:type="spellEnd"/>
-      <w:r>
-        <w:rPr>
-          <w:rFonts w:ascii="Arial" w:hAnsi="Arial" w:cs="Arial"/>
-        </w:rPr>
-        <w:t xml:space="preserve">:   </w:t>
+        <w:t xml:space="preserve">Considerando:   </w:t>
       </w:r>
       <w:r>
         <w:rPr>
@@ -3969,19 +3897,11 @@
           <w:rFonts w:ascii="Arial" w:hAnsi="Arial" w:cs="Arial"/>
         </w:rPr>
       </w:pPr>
-      <w:proofErr w:type="spellStart"/>
-      <w:r>
-        <w:rPr>
-          <w:rFonts w:ascii="Arial" w:hAnsi="Arial" w:cs="Arial"/>
-        </w:rPr>
-        <w:t>Considerando</w:t>
-      </w:r>
-      <w:proofErr w:type="spellEnd"/>
-      <w:r>
-        <w:rPr>
-          <w:rFonts w:ascii="Arial" w:hAnsi="Arial" w:cs="Arial"/>
-        </w:rPr>
-        <w:t xml:space="preserve">: </w:t>
+      <w:r>
+        <w:rPr>
+          <w:rFonts w:ascii="Arial" w:hAnsi="Arial" w:cs="Arial"/>
+        </w:rPr>
+        <w:t xml:space="preserve">Considerando: </w:t>
       </w:r>
       <w:r>
         <w:rPr>
@@ -4892,23 +4812,7 @@
           <w:lang w:val="es-AR"/>
         </w:rPr>
         <w:lastRenderedPageBreak/>
-        <w:t>de 2,</w:t>
-      </w:r>
-      <w:proofErr w:type="gramStart"/>
-      <w:r>
-        <w:rPr>
-          <w:rFonts w:ascii="Arial" w:hAnsi="Arial" w:cs="Arial"/>
-          <w:lang w:val="es-AR"/>
-        </w:rPr>
-        <w:t>5V</w:t>
-      </w:r>
-      <w:proofErr w:type="gramEnd"/>
-      <w:r>
-        <w:rPr>
-          <w:rFonts w:ascii="Arial" w:hAnsi="Arial" w:cs="Arial"/>
-          <w:lang w:val="es-AR"/>
-        </w:rPr>
-        <w:t xml:space="preserve"> sino que estaba trabajando como un amplificador operacional diferencial dándonos una ganancia diferente por la configuración de las resistencias.</w:t>
+        <w:t>de 2,5V sino que estaba trabajando como un amplificador operacional diferencial dándonos una ganancia diferente por la configuración de las resistencias.</w:t>
       </w:r>
     </w:p>
     <w:p>
@@ -5321,21 +5225,7 @@
         <w:rPr>
           <w:lang w:val="es-AR"/>
         </w:rPr>
-        <w:t xml:space="preserve"> (Esc. V=1V/</w:t>
-      </w:r>
-      <w:proofErr w:type="spellStart"/>
-      <w:r>
-        <w:rPr>
-          <w:lang w:val="es-AR"/>
-        </w:rPr>
-        <w:t>div</w:t>
-      </w:r>
-      <w:proofErr w:type="spellEnd"/>
-      <w:r>
-        <w:rPr>
-          <w:lang w:val="es-AR"/>
-        </w:rPr>
-        <w:t>)</w:t>
+        <w:t xml:space="preserve"> (Esc. V=1V/div)</w:t>
       </w:r>
     </w:p>
     <w:p>
@@ -5407,19 +5297,11 @@
           <w:rFonts w:ascii="Arial" w:hAnsi="Arial" w:cs="Arial"/>
         </w:rPr>
       </w:pPr>
-      <w:proofErr w:type="spellStart"/>
-      <w:r>
-        <w:rPr>
-          <w:rFonts w:ascii="Arial" w:hAnsi="Arial" w:cs="Arial"/>
-        </w:rPr>
-        <w:t>Considerando</w:t>
-      </w:r>
-      <w:proofErr w:type="spellEnd"/>
-      <w:r>
-        <w:rPr>
-          <w:rFonts w:ascii="Arial" w:hAnsi="Arial" w:cs="Arial"/>
-        </w:rPr>
-        <w:t>:   R</w:t>
+      <w:r>
+        <w:rPr>
+          <w:rFonts w:ascii="Arial" w:hAnsi="Arial" w:cs="Arial"/>
+        </w:rPr>
+        <w:t>Considerando:   R</w:t>
       </w:r>
       <w:r>
         <w:rPr>
@@ -5725,23 +5607,7 @@
           <w:rFonts w:ascii="Arial" w:hAnsi="Arial" w:cs="Arial"/>
           <w:lang w:val="es-AR"/>
         </w:rPr>
-        <w:t>= (2 * 1K * 5</w:t>
-      </w:r>
-      <w:proofErr w:type="gramStart"/>
-      <w:r>
-        <w:rPr>
-          <w:rFonts w:ascii="Arial" w:hAnsi="Arial" w:cs="Arial"/>
-          <w:lang w:val="es-AR"/>
-        </w:rPr>
-        <w:t>V)/</w:t>
-      </w:r>
-      <w:proofErr w:type="gramEnd"/>
-      <w:r>
-        <w:rPr>
-          <w:rFonts w:ascii="Arial" w:hAnsi="Arial" w:cs="Arial"/>
-          <w:lang w:val="es-AR"/>
-        </w:rPr>
-        <w:t xml:space="preserve"> 2,5V - 1K = 3Kohm</w:t>
+        <w:t>= (2 * 1K * 5V)/ 2,5V - 1K = 3Kohm</w:t>
       </w:r>
     </w:p>
     <w:p>
@@ -5963,21 +5829,7 @@
         <w:rPr>
           <w:lang w:val="es-AR"/>
         </w:rPr>
-        <w:t>modificación (Esc. V=1V/</w:t>
-      </w:r>
-      <w:proofErr w:type="spellStart"/>
-      <w:r>
-        <w:rPr>
-          <w:lang w:val="es-AR"/>
-        </w:rPr>
-        <w:t>div</w:t>
-      </w:r>
-      <w:proofErr w:type="spellEnd"/>
-      <w:r>
-        <w:rPr>
-          <w:lang w:val="es-AR"/>
-        </w:rPr>
-        <w:t>)</w:t>
+        <w:t>modificación (Esc. V=1V/div)</w:t>
       </w:r>
     </w:p>
     <w:p>
@@ -6132,19 +5984,11 @@
           <w:rFonts w:ascii="Arial" w:hAnsi="Arial" w:cs="Arial"/>
         </w:rPr>
       </w:pPr>
-      <w:proofErr w:type="spellStart"/>
-      <w:r>
-        <w:rPr>
-          <w:rFonts w:ascii="Arial" w:hAnsi="Arial" w:cs="Arial"/>
-        </w:rPr>
-        <w:t>Entonces</w:t>
-      </w:r>
-      <w:proofErr w:type="spellEnd"/>
-      <w:r>
-        <w:rPr>
-          <w:rFonts w:ascii="Arial" w:hAnsi="Arial" w:cs="Arial"/>
-        </w:rPr>
-        <w:t>:   R</w:t>
+      <w:r>
+        <w:rPr>
+          <w:rFonts w:ascii="Arial" w:hAnsi="Arial" w:cs="Arial"/>
+        </w:rPr>
+        <w:t>Entonces:   R</w:t>
       </w:r>
       <w:r>
         <w:rPr>
@@ -6496,7 +6340,7 @@
           <w:lang w:val="es-AR"/>
         </w:rPr>
         <w:drawing>
-          <wp:inline distT="0" distB="0" distL="0" distR="0" wp14:anchorId="0A67BAA5" wp14:editId="25529BC6">
+          <wp:inline distT="0" distB="0" distL="0" distR="0" wp14:anchorId="0A67BAA5" wp14:editId="129BCC2B">
             <wp:extent cx="5547360" cy="2555102"/>
             <wp:effectExtent l="0" t="0" r="0" b="0"/>
             <wp:docPr id="223716201" name="Imagen 4"/>
@@ -6606,21 +6450,7 @@
         <w:rPr>
           <w:lang w:val="es-AR"/>
         </w:rPr>
-        <w:t xml:space="preserve"> (Esc. V=1V/</w:t>
-      </w:r>
-      <w:proofErr w:type="spellStart"/>
-      <w:r>
-        <w:rPr>
-          <w:lang w:val="es-AR"/>
-        </w:rPr>
-        <w:t>div</w:t>
-      </w:r>
-      <w:proofErr w:type="spellEnd"/>
-      <w:r>
-        <w:rPr>
-          <w:lang w:val="es-AR"/>
-        </w:rPr>
-        <w:t>)</w:t>
+        <w:t xml:space="preserve"> (Esc. V=1V/div)</w:t>
       </w:r>
     </w:p>
     <w:p>
@@ -7269,23 +7099,7 @@
           <w:rFonts w:ascii="Arial" w:hAnsi="Arial" w:cs="Arial"/>
           <w:lang w:val="es-AR"/>
         </w:rPr>
-        <w:t xml:space="preserve">En dicho código configuramos los registros del ADC para que funcione cuando se dispare el timer mientras que en el timer tuvimos que configurar los registros con un prescaler de 64 para </w:t>
-      </w:r>
-      <w:proofErr w:type="spellStart"/>
-      <w:r>
-        <w:rPr>
-          <w:rFonts w:ascii="Arial" w:hAnsi="Arial" w:cs="Arial"/>
-          <w:lang w:val="es-AR"/>
-        </w:rPr>
-        <w:t>setear</w:t>
-      </w:r>
-      <w:proofErr w:type="spellEnd"/>
-      <w:r>
-        <w:rPr>
-          <w:rFonts w:ascii="Arial" w:hAnsi="Arial" w:cs="Arial"/>
-          <w:lang w:val="es-AR"/>
-        </w:rPr>
-        <w:t xml:space="preserve"> la velocidad de disparo de este.</w:t>
+        <w:t>En dicho código configuramos los registros del ADC para que funcione cuando se dispare el timer mientras que en el timer tuvimos que configurar los registros con un prescaler de 64 para setear la velocidad de disparo de este.</w:t>
       </w:r>
     </w:p>
     <w:p>
@@ -7382,23 +7196,7 @@
           <w:rFonts w:ascii="Arial" w:hAnsi="Arial" w:cs="Arial"/>
           <w:lang w:val="es-AR"/>
         </w:rPr>
-        <w:t xml:space="preserve">Aumentar la velocidad de transmisión del puerto serie, se utiliza una función denominada </w:t>
-      </w:r>
-      <w:proofErr w:type="spellStart"/>
-      <w:r>
-        <w:rPr>
-          <w:rFonts w:ascii="Arial" w:hAnsi="Arial" w:cs="Arial"/>
-          <w:lang w:val="es-AR"/>
-        </w:rPr>
-        <w:t>Serial.begin</w:t>
-      </w:r>
-      <w:proofErr w:type="spellEnd"/>
-      <w:r>
-        <w:rPr>
-          <w:rFonts w:ascii="Arial" w:hAnsi="Arial" w:cs="Arial"/>
-          <w:lang w:val="es-AR"/>
-        </w:rPr>
-        <w:t xml:space="preserve"> para especificar la velocidad de transmisión de puerto. En nuestro caso podríamos subir la velocidad de 9600 baudios(bits/segundos) a 2.000.000 baudios(bits/segundos). Esto debería permitir que se envíen los datos antes de que se genere la interrupción de lectura del AD</w:t>
+        <w:t>Aumentar la velocidad de transmisión del puerto serie, se utiliza una función denominada Serial.begin para especificar la velocidad de transmisión de puerto. En nuestro caso podríamos subir la velocidad de 9600 baudios(bits/segundos) a 2.000.000 baudios(bits/segundos). Esto debería permitir que se envíen los datos antes de que se genere la interrupción de lectura del AD</w:t>
       </w:r>
       <w:r>
         <w:rPr>
@@ -7427,23 +7225,7 @@
           <w:rFonts w:ascii="Arial" w:hAnsi="Arial" w:cs="Arial"/>
           <w:lang w:val="es-AR"/>
         </w:rPr>
-        <w:t xml:space="preserve">No utilizar la función </w:t>
-      </w:r>
-      <w:proofErr w:type="spellStart"/>
-      <w:r>
-        <w:rPr>
-          <w:rFonts w:ascii="Arial" w:hAnsi="Arial" w:cs="Arial"/>
-          <w:lang w:val="es-AR"/>
-        </w:rPr>
-        <w:t>Serial.print</w:t>
-      </w:r>
-      <w:proofErr w:type="spellEnd"/>
-      <w:r>
-        <w:rPr>
-          <w:rFonts w:ascii="Arial" w:hAnsi="Arial" w:cs="Arial"/>
-          <w:lang w:val="es-AR"/>
-        </w:rPr>
-        <w:t xml:space="preserve"> para </w:t>
+        <w:t xml:space="preserve">No utilizar la función Serial.print para </w:t>
       </w:r>
       <w:r>
         <w:rPr>
@@ -7464,23 +7246,7 @@
           <w:rFonts w:ascii="Arial" w:hAnsi="Arial" w:cs="Arial"/>
           <w:lang w:val="es-AR"/>
         </w:rPr>
-        <w:t xml:space="preserve">, no obstante, este proceso es muy lento y podemos agilizarlo convirtiendo los valores leídos manualmente en código ASCI utilizando una función creada por nosotros y mandar el resultado obtenido utilizando </w:t>
-      </w:r>
-      <w:proofErr w:type="spellStart"/>
-      <w:r>
-        <w:rPr>
-          <w:rFonts w:ascii="Arial" w:hAnsi="Arial" w:cs="Arial"/>
-          <w:lang w:val="es-AR"/>
-        </w:rPr>
-        <w:t>Serial.write</w:t>
-      </w:r>
-      <w:proofErr w:type="spellEnd"/>
-      <w:r>
-        <w:rPr>
-          <w:rFonts w:ascii="Arial" w:hAnsi="Arial" w:cs="Arial"/>
-          <w:lang w:val="es-AR"/>
-        </w:rPr>
-        <w:t xml:space="preserve"> que imprime los datos en binario. </w:t>
+        <w:t xml:space="preserve">, no obstante, este proceso es muy lento y podemos agilizarlo convirtiendo los valores leídos manualmente en código ASCI utilizando una función creada por nosotros y mandar el resultado obtenido utilizando Serial.write que imprime los datos en binario. </w:t>
       </w:r>
     </w:p>
     <w:p>
@@ -7581,23 +7347,7 @@
           <w:rFonts w:ascii="Arial" w:hAnsi="Arial" w:cs="Arial"/>
           <w:lang w:val="es-AR"/>
         </w:rPr>
-        <w:t xml:space="preserve">y buscando asesoría en videos y no encontrar respuesta optamos por releer la </w:t>
-      </w:r>
-      <w:proofErr w:type="spellStart"/>
-      <w:r>
-        <w:rPr>
-          <w:rFonts w:ascii="Arial" w:hAnsi="Arial" w:cs="Arial"/>
-          <w:lang w:val="es-AR"/>
-        </w:rPr>
-        <w:t>datasheet</w:t>
-      </w:r>
-      <w:proofErr w:type="spellEnd"/>
-      <w:r>
-        <w:rPr>
-          <w:rFonts w:ascii="Arial" w:hAnsi="Arial" w:cs="Arial"/>
-          <w:lang w:val="es-AR"/>
-        </w:rPr>
-        <w:t xml:space="preserve"> del microcontrolador en busca de mayor información de los registros y configuraciones, después de intentar cambiando velocidades de comunicación y de operación del timer, ADC y el puerto serie finalmente encontramos el problema. </w:t>
+        <w:t xml:space="preserve">y buscando asesoría en videos y no encontrar respuesta optamos por releer la datasheet del microcontrolador en busca de mayor información de los registros y configuraciones, después de intentar cambiando velocidades de comunicación y de operación del timer, ADC y el puerto serie finalmente encontramos el problema. </w:t>
       </w:r>
     </w:p>
     <w:p>
@@ -7699,7 +7449,6 @@
           <w:lang w:val="es-AR"/>
         </w:rPr>
       </w:pPr>
-      <w:proofErr w:type="spellStart"/>
       <w:r>
         <w:rPr>
           <w:rFonts w:ascii="Courier New" w:hAnsi="Courier New" w:cs="Courier New"/>
@@ -7709,34 +7458,14 @@
         <w:lastRenderedPageBreak/>
         <w:t>void</w:t>
       </w:r>
-      <w:proofErr w:type="spellEnd"/>
       <w:r>
         <w:rPr>
           <w:rFonts w:ascii="Courier New" w:hAnsi="Courier New" w:cs="Courier New"/>
           <w:color w:val="434F54"/>
           <w:lang w:val="es-AR"/>
         </w:rPr>
-        <w:t xml:space="preserve"> </w:t>
-      </w:r>
-      <w:proofErr w:type="spellStart"/>
-      <w:r>
-        <w:rPr>
-          <w:rFonts w:ascii="Courier New" w:hAnsi="Courier New" w:cs="Courier New"/>
-          <w:color w:val="434F54"/>
-          <w:lang w:val="es-AR"/>
-        </w:rPr>
-        <w:t>config_ADC</w:t>
-      </w:r>
-      <w:proofErr w:type="spellEnd"/>
-      <w:r>
-        <w:rPr>
-          <w:rFonts w:ascii="Courier New" w:hAnsi="Courier New" w:cs="Courier New"/>
-          <w:color w:val="434F54"/>
-          <w:lang w:val="es-AR"/>
-        </w:rPr>
-        <w:t>(</w:t>
-      </w:r>
-      <w:proofErr w:type="spellStart"/>
+        <w:t xml:space="preserve"> config_ADC(</w:t>
+      </w:r>
       <w:r>
         <w:rPr>
           <w:rFonts w:ascii="Courier New" w:hAnsi="Courier New" w:cs="Courier New"/>
@@ -7745,7 +7474,6 @@
         </w:rPr>
         <w:t>void</w:t>
       </w:r>
-      <w:proofErr w:type="spellEnd"/>
       <w:r>
         <w:rPr>
           <w:rFonts w:ascii="Courier New" w:hAnsi="Courier New" w:cs="Courier New"/>
@@ -7846,32 +7574,14 @@
           <w:highlight w:val="yellow"/>
           <w:lang w:val="es-AR"/>
         </w:rPr>
-        <w:t xml:space="preserve">// 0100 0001 voltaje de </w:t>
-      </w:r>
-      <w:proofErr w:type="spellStart"/>
+        <w:t xml:space="preserve">// 0100 0001 voltaje de ref = 5v, justificación derecha, medida por el canal </w:t>
+      </w:r>
       <w:r>
         <w:rPr>
           <w:rFonts w:ascii="Courier New" w:hAnsi="Courier New" w:cs="Courier New"/>
           <w:highlight w:val="yellow"/>
           <w:lang w:val="es-AR"/>
         </w:rPr>
-        <w:t>ref</w:t>
-      </w:r>
-      <w:proofErr w:type="spellEnd"/>
-      <w:r>
-        <w:rPr>
-          <w:rFonts w:ascii="Courier New" w:hAnsi="Courier New" w:cs="Courier New"/>
-          <w:highlight w:val="yellow"/>
-          <w:lang w:val="es-AR"/>
-        </w:rPr>
-        <w:t xml:space="preserve"> = 5v, justificación derecha, medida por el canal </w:t>
-      </w:r>
-      <w:r>
-        <w:rPr>
-          <w:rFonts w:ascii="Courier New" w:hAnsi="Courier New" w:cs="Courier New"/>
-          <w:highlight w:val="yellow"/>
-          <w:lang w:val="es-AR"/>
-        </w:rPr>
         <w:t>0</w:t>
       </w:r>
       <w:r>
@@ -7904,55 +7614,7 @@
           <w:rFonts w:ascii="Courier New" w:hAnsi="Courier New" w:cs="Courier New"/>
           <w:lang w:val="es-AR"/>
         </w:rPr>
-        <w:t xml:space="preserve">// 1010 1100 Habilito el conversor ADC, Habilita la </w:t>
-      </w:r>
-      <w:proofErr w:type="spellStart"/>
-      <w:r>
-        <w:rPr>
-          <w:rFonts w:ascii="Courier New" w:hAnsi="Courier New" w:cs="Courier New"/>
-          <w:lang w:val="es-AR"/>
-        </w:rPr>
-        <w:t>interrupcion</w:t>
-      </w:r>
-      <w:proofErr w:type="spellEnd"/>
-      <w:r>
-        <w:rPr>
-          <w:rFonts w:ascii="Courier New" w:hAnsi="Courier New" w:cs="Courier New"/>
-          <w:lang w:val="es-AR"/>
-        </w:rPr>
-        <w:t xml:space="preserve">, </w:t>
-      </w:r>
-      <w:proofErr w:type="spellStart"/>
-      <w:r>
-        <w:rPr>
-          <w:rFonts w:ascii="Courier New" w:hAnsi="Courier New" w:cs="Courier New"/>
-          <w:lang w:val="es-AR"/>
-        </w:rPr>
-        <w:t>INicia</w:t>
-      </w:r>
-      <w:proofErr w:type="spellEnd"/>
-      <w:r>
-        <w:rPr>
-          <w:rFonts w:ascii="Courier New" w:hAnsi="Courier New" w:cs="Courier New"/>
-          <w:lang w:val="es-AR"/>
-        </w:rPr>
-        <w:t xml:space="preserve"> el </w:t>
-      </w:r>
-      <w:proofErr w:type="spellStart"/>
-      <w:r>
-        <w:rPr>
-          <w:rFonts w:ascii="Courier New" w:hAnsi="Courier New" w:cs="Courier New"/>
-          <w:lang w:val="es-AR"/>
-        </w:rPr>
-        <w:t>preecalador</w:t>
-      </w:r>
-      <w:proofErr w:type="spellEnd"/>
-      <w:r>
-        <w:rPr>
-          <w:rFonts w:ascii="Courier New" w:hAnsi="Courier New" w:cs="Courier New"/>
-          <w:lang w:val="es-AR"/>
-        </w:rPr>
-        <w:t xml:space="preserve"> en 16</w:t>
+        <w:t>// 1010 1100 Habilito el conversor ADC, Habilita la interrupcion, INicia el preecalador en 16</w:t>
       </w:r>
       <w:r>
         <w:rPr>
@@ -7984,49 +7646,8 @@
           <w:rFonts w:ascii="Courier New" w:hAnsi="Courier New" w:cs="Courier New"/>
           <w:lang w:val="es-AR"/>
         </w:rPr>
-        <w:t xml:space="preserve">// 0100 0101 AD </w:t>
-      </w:r>
-      <w:proofErr w:type="spellStart"/>
-      <w:r>
-        <w:rPr>
-          <w:rFonts w:ascii="Courier New" w:hAnsi="Courier New" w:cs="Courier New"/>
-          <w:lang w:val="es-AR"/>
-        </w:rPr>
-        <w:t>channels</w:t>
-      </w:r>
-      <w:proofErr w:type="spellEnd"/>
-      <w:r>
-        <w:rPr>
-          <w:rFonts w:ascii="Courier New" w:hAnsi="Courier New" w:cs="Courier New"/>
-          <w:lang w:val="es-AR"/>
-        </w:rPr>
-        <w:t xml:space="preserve"> MUX </w:t>
-      </w:r>
-      <w:proofErr w:type="spellStart"/>
-      <w:r>
-        <w:rPr>
-          <w:rFonts w:ascii="Courier New" w:hAnsi="Courier New" w:cs="Courier New"/>
-          <w:lang w:val="es-AR"/>
-        </w:rPr>
-        <w:t>on</w:t>
-      </w:r>
-      <w:proofErr w:type="spellEnd"/>
-      <w:r>
-        <w:rPr>
-          <w:rFonts w:ascii="Courier New" w:hAnsi="Courier New" w:cs="Courier New"/>
-          <w:lang w:val="es-AR"/>
-        </w:rPr>
-        <w:t xml:space="preserve">, free running </w:t>
-      </w:r>
-      <w:proofErr w:type="spellStart"/>
-      <w:r>
-        <w:rPr>
-          <w:rFonts w:ascii="Courier New" w:hAnsi="Courier New" w:cs="Courier New"/>
-          <w:lang w:val="es-AR"/>
-        </w:rPr>
-        <w:t>mode</w:t>
-      </w:r>
-      <w:proofErr w:type="spellEnd"/>
+        <w:t>// 0100 0101 AD channels MUX on, free running mode</w:t>
+      </w:r>
       <w:r>
         <w:rPr>
           <w:rFonts w:ascii="Courier New" w:hAnsi="Courier New" w:cs="Courier New"/>
@@ -8050,64 +7671,21 @@
           <w:lang w:val="es-AR"/>
         </w:rPr>
         <w:br/>
-        <w:t xml:space="preserve">  </w:t>
-      </w:r>
-      <w:proofErr w:type="spellStart"/>
+        <w:t xml:space="preserve">  sei();                   </w:t>
+      </w:r>
+      <w:r>
+        <w:rPr>
+          <w:rFonts w:ascii="Courier New" w:hAnsi="Courier New" w:cs="Courier New"/>
+          <w:lang w:val="es-AR"/>
+        </w:rPr>
+        <w:t>// set interrupt flag</w:t>
+      </w:r>
       <w:r>
         <w:rPr>
           <w:rFonts w:ascii="Courier New" w:hAnsi="Courier New" w:cs="Courier New"/>
           <w:color w:val="434F54"/>
           <w:lang w:val="es-AR"/>
         </w:rPr>
-        <w:t>sei</w:t>
-      </w:r>
-      <w:proofErr w:type="spellEnd"/>
-      <w:r>
-        <w:rPr>
-          <w:rFonts w:ascii="Courier New" w:hAnsi="Courier New" w:cs="Courier New"/>
-          <w:color w:val="434F54"/>
-          <w:lang w:val="es-AR"/>
-        </w:rPr>
-        <w:t xml:space="preserve">();                   </w:t>
-      </w:r>
-      <w:r>
-        <w:rPr>
-          <w:rFonts w:ascii="Courier New" w:hAnsi="Courier New" w:cs="Courier New"/>
-          <w:lang w:val="es-AR"/>
-        </w:rPr>
-        <w:t xml:space="preserve">// set </w:t>
-      </w:r>
-      <w:proofErr w:type="spellStart"/>
-      <w:r>
-        <w:rPr>
-          <w:rFonts w:ascii="Courier New" w:hAnsi="Courier New" w:cs="Courier New"/>
-          <w:lang w:val="es-AR"/>
-        </w:rPr>
-        <w:t>interrupt</w:t>
-      </w:r>
-      <w:proofErr w:type="spellEnd"/>
-      <w:r>
-        <w:rPr>
-          <w:rFonts w:ascii="Courier New" w:hAnsi="Courier New" w:cs="Courier New"/>
-          <w:lang w:val="es-AR"/>
-        </w:rPr>
-        <w:t xml:space="preserve"> </w:t>
-      </w:r>
-      <w:proofErr w:type="spellStart"/>
-      <w:r>
-        <w:rPr>
-          <w:rFonts w:ascii="Courier New" w:hAnsi="Courier New" w:cs="Courier New"/>
-          <w:lang w:val="es-AR"/>
-        </w:rPr>
-        <w:t>flag</w:t>
-      </w:r>
-      <w:proofErr w:type="spellEnd"/>
-      <w:r>
-        <w:rPr>
-          <w:rFonts w:ascii="Courier New" w:hAnsi="Courier New" w:cs="Courier New"/>
-          <w:color w:val="434F54"/>
-          <w:lang w:val="es-AR"/>
-        </w:rPr>
         <w:br/>
         <w:t xml:space="preserve">  }</w:t>
       </w:r>
@@ -8244,23 +7822,7 @@
           <w:rFonts w:ascii="Arial" w:hAnsi="Arial" w:cs="Arial"/>
           <w:lang w:val="es-AR"/>
         </w:rPr>
-        <w:t xml:space="preserve">Una </w:t>
-      </w:r>
-      <w:proofErr w:type="spellStart"/>
-      <w:r>
-        <w:rPr>
-          <w:rFonts w:ascii="Arial" w:hAnsi="Arial" w:cs="Arial"/>
-          <w:lang w:val="es-AR"/>
-        </w:rPr>
-        <w:t>ves</w:t>
-      </w:r>
-      <w:proofErr w:type="spellEnd"/>
-      <w:r>
-        <w:rPr>
-          <w:rFonts w:ascii="Arial" w:hAnsi="Arial" w:cs="Arial"/>
-          <w:lang w:val="es-AR"/>
-        </w:rPr>
-        <w:t xml:space="preserve"> pasados todos estos inconvenientes pudimos </w:t>
+        <w:t xml:space="preserve">Una ves pasados todos estos inconvenientes pudimos </w:t>
       </w:r>
       <w:r>
         <w:rPr>
@@ -8481,32 +8043,32 @@
           <w:lang w:val="es-AR"/>
         </w:rPr>
       </w:pPr>
-      <w:proofErr w:type="spellStart"/>
-      <w:r>
-        <w:t>Figura</w:t>
-      </w:r>
-      <w:proofErr w:type="spellEnd"/>
-      <w:r>
-        <w:t xml:space="preserve"> </w:t>
-      </w:r>
-      <w:fldSimple w:instr=" SEQ Figura \* ARABIC ">
-        <w:r>
-          <w:rPr>
-            <w:noProof/>
-          </w:rPr>
-          <w:t>9</w:t>
-        </w:r>
-      </w:fldSimple>
-      <w:r>
-        <w:t xml:space="preserve">. </w:t>
-      </w:r>
-      <w:proofErr w:type="spellStart"/>
-      <w:r>
-        <w:t>Circuito</w:t>
-      </w:r>
-      <w:proofErr w:type="spellEnd"/>
-      <w:r>
-        <w:t xml:space="preserve"> final</w:t>
+      <w:r>
+        <w:t xml:space="preserve">Figura </w:t>
+      </w:r>
+      <w:r>
+        <w:fldChar w:fldCharType="begin"/>
+      </w:r>
+      <w:r>
+        <w:instrText xml:space="preserve"> SEQ Figura \* ARABIC </w:instrText>
+      </w:r>
+      <w:r>
+        <w:fldChar w:fldCharType="separate"/>
+      </w:r>
+      <w:r>
+        <w:rPr>
+          <w:noProof/>
+        </w:rPr>
+        <w:t>9</w:t>
+      </w:r>
+      <w:r>
+        <w:rPr>
+          <w:noProof/>
+        </w:rPr>
+        <w:fldChar w:fldCharType="end"/>
+      </w:r>
+      <w:r>
+        <w:t>. Circuito final</w:t>
       </w:r>
     </w:p>
     <w:p>
@@ -8652,21 +8214,7 @@
         <w:rPr>
           <w:lang w:val="es-AR"/>
         </w:rPr>
-        <w:t xml:space="preserve">“Amplificadores y Comparadores” </w:t>
-      </w:r>
-      <w:proofErr w:type="spellStart"/>
-      <w:r>
-        <w:rPr>
-          <w:lang w:val="es-AR"/>
-        </w:rPr>
-        <w:t>datasheet</w:t>
-      </w:r>
-      <w:proofErr w:type="spellEnd"/>
-      <w:r>
-        <w:rPr>
-          <w:lang w:val="es-AR"/>
-        </w:rPr>
-        <w:t>:</w:t>
+        <w:t>“Amplificadores y Comparadores” datasheet:</w:t>
       </w:r>
     </w:p>
     <w:p>
@@ -8823,23 +8371,7 @@
           <w:rFonts w:ascii="Arial" w:hAnsi="Arial" w:cs="Arial"/>
           <w:lang w:val="es-AR"/>
         </w:rPr>
-        <w:t xml:space="preserve">Placa de desarrollo Arduino Mega 2560 </w:t>
-      </w:r>
-      <w:proofErr w:type="spellStart"/>
-      <w:r>
-        <w:rPr>
-          <w:rFonts w:ascii="Arial" w:hAnsi="Arial" w:cs="Arial"/>
-          <w:lang w:val="es-AR"/>
-        </w:rPr>
-        <w:t>datasheet</w:t>
-      </w:r>
-      <w:proofErr w:type="spellEnd"/>
-      <w:r>
-        <w:rPr>
-          <w:rFonts w:ascii="Arial" w:hAnsi="Arial" w:cs="Arial"/>
-          <w:lang w:val="es-AR"/>
-        </w:rPr>
-        <w:t>:</w:t>
+        <w:t>Placa de desarrollo Arduino Mega 2560 datasheet:</w:t>
       </w:r>
     </w:p>
     <w:p>
@@ -8967,23 +8499,7 @@
           <w:rFonts w:ascii="Arial" w:hAnsi="Arial" w:cs="Arial"/>
           <w:lang w:val="es-AR"/>
         </w:rPr>
-        <w:t xml:space="preserve">Microcontrolador ATmega-2560 </w:t>
-      </w:r>
-      <w:proofErr w:type="spellStart"/>
-      <w:r>
-        <w:rPr>
-          <w:rFonts w:ascii="Arial" w:hAnsi="Arial" w:cs="Arial"/>
-          <w:lang w:val="es-AR"/>
-        </w:rPr>
-        <w:t>datasheet</w:t>
-      </w:r>
-      <w:proofErr w:type="spellEnd"/>
-      <w:r>
-        <w:rPr>
-          <w:rFonts w:ascii="Arial" w:hAnsi="Arial" w:cs="Arial"/>
-          <w:lang w:val="es-AR"/>
-        </w:rPr>
-        <w:t>:</w:t>
+        <w:t>Microcontrolador ATmega-2560 datasheet:</w:t>
       </w:r>
     </w:p>
     <w:p>
@@ -9701,39 +9217,7 @@
           <w:rFonts w:ascii="Arial" w:hAnsi="Arial" w:cs="Arial"/>
           <w:lang w:val="es-AR"/>
         </w:rPr>
-        <w:t xml:space="preserve">El circuito ira conectado a salidas digitales del Arduino y utilizara cuantos pines digitales como cuanta resolución quiera el usuario a la hora de recrear las señales. Cuantos más pines utilicemos a la salida mejor se </w:t>
-      </w:r>
-      <w:proofErr w:type="spellStart"/>
-      <w:r>
-        <w:rPr>
-          <w:rFonts w:ascii="Arial" w:hAnsi="Arial" w:cs="Arial"/>
-          <w:lang w:val="es-AR"/>
-        </w:rPr>
-        <w:t>vera</w:t>
-      </w:r>
-      <w:proofErr w:type="spellEnd"/>
-      <w:r>
-        <w:rPr>
-          <w:rFonts w:ascii="Arial" w:hAnsi="Arial" w:cs="Arial"/>
-          <w:lang w:val="es-AR"/>
-        </w:rPr>
-        <w:t xml:space="preserve"> la señal de salida sin embargo </w:t>
-      </w:r>
-      <w:proofErr w:type="spellStart"/>
-      <w:r>
-        <w:rPr>
-          <w:rFonts w:ascii="Arial" w:hAnsi="Arial" w:cs="Arial"/>
-          <w:lang w:val="es-AR"/>
-        </w:rPr>
-        <w:t>si</w:t>
-      </w:r>
-      <w:proofErr w:type="spellEnd"/>
-      <w:r>
-        <w:rPr>
-          <w:rFonts w:ascii="Arial" w:hAnsi="Arial" w:cs="Arial"/>
-          <w:lang w:val="es-AR"/>
-        </w:rPr>
-        <w:t xml:space="preserve"> embargo esto puede ser una desventaja en placas de desarrollo que no cuente con una cantidad de pines digitales y que tengan que realizar otras tareas además de la recreación de señales. También en cuanto a amplitud nos encontramos que la máxima de la señal generada serán 5V que es a tensión máxima de los pines del Arduino por lo que si se querrá generar señales con una amplitud mayor a 5V se deberá realizar modificaciones en el circuito o directamente construir uno diferente. A su vez como alimentamos el circuito R2R con la tensión de los </w:t>
+        <w:t xml:space="preserve">El circuito ira conectado a salidas digitales del Arduino y utilizara cuantos pines digitales como cuanta resolución quiera el usuario a la hora de recrear las señales. Cuantos más pines utilicemos a la salida mejor se vera la señal de salida sin embargo si embargo esto puede ser una desventaja en placas de desarrollo que no cuente con una cantidad de pines digitales y que tengan que realizar otras tareas además de la recreación de señales. También en cuanto a amplitud nos encontramos que la máxima de la señal generada serán 5V que es a tensión máxima de los pines del Arduino por lo que si se querrá generar señales con una amplitud mayor a 5V se deberá realizar modificaciones en el circuito o directamente construir uno diferente. A su vez como alimentamos el circuito R2R con la tensión de los </w:t>
       </w:r>
       <w:r>
         <w:rPr>
@@ -9899,15 +9383,13 @@
         </w:rPr>
         <w:t xml:space="preserve">Para realizar la explicación de </w:t>
       </w:r>
-      <w:proofErr w:type="spellStart"/>
-      <w:r>
-        <w:rPr>
-          <w:rFonts w:ascii="Arial" w:hAnsi="Arial" w:cs="Arial"/>
-          <w:lang w:val="es-AR"/>
-        </w:rPr>
-        <w:t>como</w:t>
-      </w:r>
-      <w:proofErr w:type="spellEnd"/>
+      <w:r>
+        <w:rPr>
+          <w:rFonts w:ascii="Arial" w:hAnsi="Arial" w:cs="Arial"/>
+          <w:lang w:val="es-AR"/>
+        </w:rPr>
+        <w:t>cómo</w:t>
+      </w:r>
       <w:r>
         <w:rPr>
           <w:rFonts w:ascii="Arial" w:hAnsi="Arial" w:cs="Arial"/>
@@ -10087,6 +9569,7 @@
         <w:t xml:space="preserve">Procedemos a realizar la simplificación a Thévenin y nos encontramos con la simplificación del circuito donde: </w:t>
       </w:r>
     </w:p>
+    <w:bookmarkStart w:id="25" w:name="_Hlk226575545"/>
     <w:p>
       <w:pPr>
         <w:jc w:val="center"/>
@@ -10198,6 +9681,7 @@
         </w:rPr>
         <w:t xml:space="preserve">     </w:t>
       </w:r>
+      <w:bookmarkEnd w:id="25"/>
       <m:oMath>
         <m:sSub>
           <m:sSubPr>
@@ -10308,7 +9792,6 @@
         <w:pStyle w:val="Descripcin"/>
         <w:jc w:val="center"/>
         <w:rPr>
-          <w:rFonts w:ascii="Arial" w:hAnsi="Arial" w:cs="Arial"/>
           <w:lang w:val="es-AR"/>
         </w:rPr>
       </w:pPr>
@@ -10366,6 +9849,19 @@
           <w:lang w:val="es-AR"/>
         </w:rPr>
         <w:t>ación</w:t>
+      </w:r>
+    </w:p>
+    <w:p>
+      <w:pPr>
+        <w:rPr>
+          <w:lang w:val="es-AR"/>
+        </w:rPr>
+      </w:pPr>
+      <w:r>
+        <w:rPr>
+          <w:lang w:val="es-AR"/>
+        </w:rPr>
+        <w:t>Después de realizar la primera simplificación observamos que la tención es la mitad que la original pero todavía quedan realizar tres simplificaciones mas para obtener la tensión de salida.</w:t>
       </w:r>
     </w:p>
     <w:p>
@@ -10436,7 +9932,6 @@
         <w:pStyle w:val="Descripcin"/>
         <w:jc w:val="center"/>
         <w:rPr>
-          <w:rFonts w:ascii="Arial" w:hAnsi="Arial" w:cs="Arial"/>
           <w:lang w:val="es-AR"/>
         </w:rPr>
       </w:pPr>
@@ -10473,13 +9968,259 @@
           <w:lang w:val="es-AR"/>
         </w:rPr>
         <w:t>. Circuito de 2°do análisis</w:t>
+      </w:r>
+    </w:p>
+    <w:p>
+      <w:pPr>
+        <w:rPr>
+          <w:lang w:val="es-AR"/>
+        </w:rPr>
+      </w:pPr>
+      <w:r>
+        <w:rPr>
+          <w:lang w:val="es-AR"/>
+        </w:rPr>
+        <w:t>Aislamos nuevamente la sección remarcada en rojo y procedemos a realizar los cálculos donde obtenemos que:</w:t>
       </w:r>
     </w:p>
     <w:p>
       <w:pPr>
         <w:keepNext/>
         <w:jc w:val="center"/>
-      </w:pPr>
+        <w:rPr>
+          <w:rFonts w:ascii="Arial" w:eastAsiaTheme="minorEastAsia" w:hAnsi="Arial" w:cs="Arial"/>
+          <w:lang w:val="es-AR"/>
+        </w:rPr>
+      </w:pPr>
+      <m:oMath>
+        <m:sSub>
+          <m:sSubPr>
+            <m:ctrlPr>
+              <w:rPr>
+                <w:rFonts w:ascii="Cambria Math" w:hAnsi="Cambria Math" w:cs="Arial"/>
+                <w:i/>
+                <w:lang w:val="es-AR"/>
+              </w:rPr>
+            </m:ctrlPr>
+          </m:sSubPr>
+          <m:e>
+            <m:r>
+              <w:rPr>
+                <w:rFonts w:ascii="Cambria Math" w:hAnsi="Cambria Math" w:cs="Arial"/>
+                <w:lang w:val="es-AR"/>
+              </w:rPr>
+              <m:t>V</m:t>
+            </m:r>
+          </m:e>
+          <m:sub>
+            <m:r>
+              <w:rPr>
+                <w:rFonts w:ascii="Cambria Math" w:hAnsi="Cambria Math" w:cs="Arial"/>
+                <w:lang w:val="es-AR"/>
+              </w:rPr>
+              <m:t>t</m:t>
+            </m:r>
+            <m:r>
+              <w:rPr>
+                <w:rFonts w:ascii="Cambria Math" w:hAnsi="Cambria Math" w:cs="Arial"/>
+                <w:lang w:val="es-AR"/>
+              </w:rPr>
+              <m:t>h</m:t>
+            </m:r>
+          </m:sub>
+        </m:sSub>
+        <m:r>
+          <w:rPr>
+            <w:rFonts w:ascii="Cambria Math" w:hAnsi="Cambria Math" w:cs="Arial"/>
+            <w:lang w:val="es-AR"/>
+          </w:rPr>
+          <m:t>=</m:t>
+        </m:r>
+        <m:f>
+          <m:fPr>
+            <m:ctrlPr>
+              <w:rPr>
+                <w:rFonts w:ascii="Cambria Math" w:hAnsi="Cambria Math" w:cs="Arial"/>
+                <w:i/>
+                <w:lang w:val="es-AR"/>
+              </w:rPr>
+            </m:ctrlPr>
+          </m:fPr>
+          <m:num>
+            <m:sSub>
+              <m:sSubPr>
+                <m:ctrlPr>
+                  <w:rPr>
+                    <w:rFonts w:ascii="Cambria Math" w:hAnsi="Cambria Math" w:cs="Arial"/>
+                    <w:i/>
+                    <w:lang w:val="es-AR"/>
+                  </w:rPr>
+                </m:ctrlPr>
+              </m:sSubPr>
+              <m:e>
+                <m:r>
+                  <w:rPr>
+                    <w:rFonts w:ascii="Cambria Math" w:hAnsi="Cambria Math" w:cs="Arial"/>
+                    <w:lang w:val="es-AR"/>
+                  </w:rPr>
+                  <m:t>V</m:t>
+                </m:r>
+              </m:e>
+              <m:sub>
+                <m:r>
+                  <w:rPr>
+                    <w:rFonts w:ascii="Cambria Math" w:hAnsi="Cambria Math" w:cs="Arial"/>
+                    <w:lang w:val="es-AR"/>
+                  </w:rPr>
+                  <m:t>0</m:t>
+                </m:r>
+              </m:sub>
+            </m:sSub>
+          </m:num>
+          <m:den>
+            <m:r>
+              <w:rPr>
+                <w:rFonts w:ascii="Cambria Math" w:hAnsi="Cambria Math" w:cs="Arial"/>
+                <w:lang w:val="es-AR"/>
+              </w:rPr>
+              <m:t>2</m:t>
+            </m:r>
+          </m:den>
+        </m:f>
+        <m:r>
+          <w:rPr>
+            <w:rFonts w:ascii="Cambria Math" w:hAnsi="Cambria Math" w:cs="Arial"/>
+            <w:lang w:val="es-AR"/>
+          </w:rPr>
+          <m:t xml:space="preserve"> ÷2=</m:t>
+        </m:r>
+        <m:f>
+          <m:fPr>
+            <m:ctrlPr>
+              <w:rPr>
+                <w:rFonts w:ascii="Cambria Math" w:hAnsi="Cambria Math" w:cs="Arial"/>
+                <w:i/>
+                <w:lang w:val="es-AR"/>
+              </w:rPr>
+            </m:ctrlPr>
+          </m:fPr>
+          <m:num>
+            <m:sSub>
+              <m:sSubPr>
+                <m:ctrlPr>
+                  <w:rPr>
+                    <w:rFonts w:ascii="Cambria Math" w:hAnsi="Cambria Math" w:cs="Arial"/>
+                    <w:i/>
+                    <w:lang w:val="es-AR"/>
+                  </w:rPr>
+                </m:ctrlPr>
+              </m:sSubPr>
+              <m:e>
+                <m:r>
+                  <w:rPr>
+                    <w:rFonts w:ascii="Cambria Math" w:hAnsi="Cambria Math" w:cs="Arial"/>
+                    <w:lang w:val="es-AR"/>
+                  </w:rPr>
+                  <m:t>V</m:t>
+                </m:r>
+              </m:e>
+              <m:sub>
+                <m:r>
+                  <w:rPr>
+                    <w:rFonts w:ascii="Cambria Math" w:hAnsi="Cambria Math" w:cs="Arial"/>
+                    <w:lang w:val="es-AR"/>
+                  </w:rPr>
+                  <m:t>0</m:t>
+                </m:r>
+              </m:sub>
+            </m:sSub>
+          </m:num>
+          <m:den>
+            <m:r>
+              <w:rPr>
+                <w:rFonts w:ascii="Cambria Math" w:hAnsi="Cambria Math" w:cs="Arial"/>
+                <w:lang w:val="es-AR"/>
+              </w:rPr>
+              <m:t>4</m:t>
+            </m:r>
+          </m:den>
+        </m:f>
+      </m:oMath>
+      <w:r>
+        <w:rPr>
+          <w:rFonts w:ascii="Arial" w:eastAsiaTheme="minorEastAsia" w:hAnsi="Arial" w:cs="Arial"/>
+          <w:lang w:val="es-AR"/>
+        </w:rPr>
+        <w:t xml:space="preserve">  </w:t>
+      </w:r>
+      <w:r>
+        <w:rPr>
+          <w:rFonts w:ascii="Arial" w:eastAsiaTheme="minorEastAsia" w:hAnsi="Arial" w:cs="Arial"/>
+          <w:lang w:val="es-AR"/>
+        </w:rPr>
+        <w:t xml:space="preserve">   </w:t>
+      </w:r>
+      <w:r>
+        <w:rPr>
+          <w:rFonts w:ascii="Arial" w:eastAsiaTheme="minorEastAsia" w:hAnsi="Arial" w:cs="Arial"/>
+          <w:lang w:val="es-AR"/>
+        </w:rPr>
+        <w:t xml:space="preserve"> </w:t>
+      </w:r>
+      <m:oMath>
+        <m:sSub>
+          <m:sSubPr>
+            <m:ctrlPr>
+              <w:rPr>
+                <w:rFonts w:ascii="Cambria Math" w:eastAsiaTheme="minorEastAsia" w:hAnsi="Cambria Math" w:cs="Arial"/>
+                <w:i/>
+                <w:lang w:val="es-AR"/>
+              </w:rPr>
+            </m:ctrlPr>
+          </m:sSubPr>
+          <m:e>
+            <m:r>
+              <w:rPr>
+                <w:rFonts w:ascii="Cambria Math" w:eastAsiaTheme="minorEastAsia" w:hAnsi="Cambria Math" w:cs="Arial"/>
+                <w:lang w:val="es-AR"/>
+              </w:rPr>
+              <m:t>R</m:t>
+            </m:r>
+          </m:e>
+          <m:sub>
+            <m:r>
+              <w:rPr>
+                <w:rFonts w:ascii="Cambria Math" w:eastAsiaTheme="minorEastAsia" w:hAnsi="Cambria Math" w:cs="Arial"/>
+                <w:lang w:val="es-AR"/>
+              </w:rPr>
+              <m:t>th</m:t>
+            </m:r>
+          </m:sub>
+        </m:sSub>
+        <m:r>
+          <w:rPr>
+            <w:rFonts w:ascii="Cambria Math" w:eastAsiaTheme="minorEastAsia" w:hAnsi="Cambria Math" w:cs="Arial"/>
+            <w:lang w:val="es-AR"/>
+          </w:rPr>
+          <m:t>= 2R || 2R = R</m:t>
+        </m:r>
+      </m:oMath>
+    </w:p>
+    <w:p>
+      <w:pPr>
+        <w:keepNext/>
+        <w:jc w:val="center"/>
+        <w:rPr>
+          <w:lang w:val="es-AR"/>
+        </w:rPr>
+      </w:pPr>
+      <w:r>
+        <w:rPr>
+          <w:rFonts w:ascii="Arial" w:eastAsiaTheme="minorEastAsia" w:hAnsi="Arial" w:cs="Arial"/>
+          <w:lang w:val="es-AR"/>
+        </w:rPr>
+        <w:t xml:space="preserve">  </w:t>
+      </w:r>
       <w:r>
         <w:rPr>
           <w:rFonts w:ascii="Arial" w:hAnsi="Arial" w:cs="Arial"/>
@@ -10543,7 +10284,6 @@
         <w:pStyle w:val="Descripcin"/>
         <w:jc w:val="center"/>
         <w:rPr>
-          <w:rFonts w:ascii="Arial" w:hAnsi="Arial" w:cs="Arial"/>
           <w:lang w:val="es-AR"/>
         </w:rPr>
       </w:pPr>
@@ -10580,6 +10320,32 @@
           <w:lang w:val="es-AR"/>
         </w:rPr>
         <w:t>. Circuito de 2°da simplificación</w:t>
+      </w:r>
+    </w:p>
+    <w:p>
+      <w:pPr>
+        <w:rPr>
+          <w:lang w:val="es-AR"/>
+        </w:rPr>
+      </w:pPr>
+      <w:r>
+        <w:rPr>
+          <w:lang w:val="es-AR"/>
+        </w:rPr>
+        <w:lastRenderedPageBreak/>
+        <w:t xml:space="preserve">Al realizar un segundo calculo ya vemos que la tensión es una cuarto de la original porque lo que ya podemos ver la tensión seguirá </w:t>
+      </w:r>
+      <w:r>
+        <w:rPr>
+          <w:lang w:val="es-AR"/>
+        </w:rPr>
+        <w:t>disminuyendo</w:t>
+      </w:r>
+      <w:r>
+        <w:rPr>
+          <w:lang w:val="es-AR"/>
+        </w:rPr>
+        <w:t xml:space="preserve"> hasta llegar al punto de salida (OUTPUT) al final del circuito.</w:t>
       </w:r>
     </w:p>
     <w:p>
@@ -10593,7 +10359,6 @@
           <w:noProof/>
           <w:lang w:val="es-AR"/>
         </w:rPr>
-        <w:lastRenderedPageBreak/>
         <w:drawing>
           <wp:inline distT="0" distB="0" distL="0" distR="0" wp14:anchorId="56E59C24" wp14:editId="41A3ECB7">
             <wp:extent cx="4151773" cy="1789200"/>
@@ -10687,16 +10452,8 @@
         <w:rPr>
           <w:lang w:val="es-AR"/>
         </w:rPr>
-        <w:t xml:space="preserve">. Circuito de 3°er </w:t>
-      </w:r>
-      <w:proofErr w:type="spellStart"/>
-      <w:r>
-        <w:rPr>
-          <w:lang w:val="es-AR"/>
-        </w:rPr>
-        <w:t>anáisis</w:t>
-      </w:r>
-      <w:proofErr w:type="spellEnd"/>
+        <w:t>. Circuito de 3°er anáisis</w:t>
+      </w:r>
     </w:p>
     <w:p>
       <w:pPr>
@@ -10923,6 +10680,7 @@
           <w:noProof/>
           <w:lang w:val="es-AR"/>
         </w:rPr>
+        <w:lastRenderedPageBreak/>
         <w:drawing>
           <wp:inline distT="0" distB="0" distL="0" distR="0" wp14:anchorId="22F14A52" wp14:editId="1DBCECE7">
             <wp:extent cx="5029200" cy="1402080"/>
@@ -11030,7 +10788,6 @@
           <w:noProof/>
           <w:lang w:val="es-AR"/>
         </w:rPr>
-        <w:lastRenderedPageBreak/>
         <w:drawing>
           <wp:inline distT="0" distB="0" distL="0" distR="0" wp14:anchorId="73D92DD6" wp14:editId="6DC0555D">
             <wp:extent cx="2186940" cy="1447800"/>
@@ -11088,7 +10845,6 @@
         <w:pStyle w:val="Descripcin"/>
         <w:jc w:val="center"/>
         <w:rPr>
-          <w:rFonts w:ascii="Arial" w:hAnsi="Arial" w:cs="Arial"/>
           <w:lang w:val="es-AR"/>
         </w:rPr>
       </w:pPr>
@@ -11131,6 +10887,32 @@
           <w:lang w:val="es-AR"/>
         </w:rPr>
         <w:t>con bit menos significativo en alto</w:t>
+      </w:r>
+    </w:p>
+    <w:p>
+      <w:pPr>
+        <w:rPr>
+          <w:lang w:val="es-AR"/>
+        </w:rPr>
+      </w:pPr>
+      <w:r>
+        <w:rPr>
+          <w:lang w:val="es-AR"/>
+        </w:rPr>
+        <w:t xml:space="preserve">Como se vio en todo el proceso desde la ilustración 3 a la ilustración 11 la tensión original va disminuyendo hasta ser 1/16 de la original. Este proceso es parecido en el caso de las otras tensiones lo único que cambia es la atenuación que se sufre. </w:t>
+      </w:r>
+    </w:p>
+    <w:p>
+      <w:pPr>
+        <w:rPr>
+          <w:lang w:val="es-AR"/>
+        </w:rPr>
+      </w:pPr>
+      <w:r>
+        <w:rPr>
+          <w:lang w:val="es-AR"/>
+        </w:rPr>
+        <w:t>A continuación, mostramos de ejemplo el caso de V3 para ilustrar otra variante del proceso:</w:t>
       </w:r>
     </w:p>
     <w:p>
@@ -11255,6 +11037,7 @@
           <w:noProof/>
           <w:lang w:val="es-AR"/>
         </w:rPr>
+        <w:lastRenderedPageBreak/>
         <w:drawing>
           <wp:inline distT="0" distB="0" distL="0" distR="0" wp14:anchorId="046171B2" wp14:editId="29536C18">
             <wp:extent cx="2217420" cy="1341120"/>
@@ -11352,14 +11135,12 @@
         </w:rPr>
         <w:t xml:space="preserve">. </w:t>
       </w:r>
-      <w:proofErr w:type="spellStart"/>
-      <w:r>
-        <w:rPr>
-          <w:lang w:val="es-AR"/>
-        </w:rPr>
-        <w:t>Circuuito</w:t>
-      </w:r>
-      <w:proofErr w:type="spellEnd"/>
+      <w:r>
+        <w:rPr>
+          <w:lang w:val="es-AR"/>
+        </w:rPr>
+        <w:t>Circuito</w:t>
+      </w:r>
       <w:r>
         <w:rPr>
           <w:lang w:val="es-AR"/>
@@ -11375,8 +11156,8 @@
           <w:lang w:val="es-AR"/>
         </w:rPr>
       </w:pPr>
-      <w:bookmarkStart w:id="25" w:name="_Toc148467760"/>
-      <w:bookmarkStart w:id="26" w:name="_Toc221175824"/>
+      <w:bookmarkStart w:id="26" w:name="_Toc148467760"/>
+      <w:bookmarkStart w:id="27" w:name="_Toc221175824"/>
       <w:r>
         <w:rPr>
           <w:rFonts w:cs="Arial"/>
@@ -11391,8 +11172,8 @@
         </w:rPr>
         <w:t>:</w:t>
       </w:r>
-      <w:bookmarkEnd w:id="25"/>
       <w:bookmarkEnd w:id="26"/>
+      <w:bookmarkEnd w:id="27"/>
     </w:p>
     <w:p>
       <w:pPr>
@@ -11401,16 +11182,16 @@
           <w:lang w:val="es-AR"/>
         </w:rPr>
       </w:pPr>
-      <w:bookmarkStart w:id="27" w:name="_Toc148467761"/>
-      <w:bookmarkStart w:id="28" w:name="_Toc221175825"/>
+      <w:bookmarkStart w:id="28" w:name="_Toc148467761"/>
+      <w:bookmarkStart w:id="29" w:name="_Toc221175825"/>
       <w:r>
         <w:rPr>
           <w:lang w:val="es-AR"/>
         </w:rPr>
         <w:t>Conclusión:</w:t>
       </w:r>
-      <w:bookmarkEnd w:id="27"/>
       <w:bookmarkEnd w:id="28"/>
+      <w:bookmarkEnd w:id="29"/>
     </w:p>
     <w:p>
       <w:pPr>
@@ -11428,16 +11209,16 @@
           <w:lang w:val="es-AR"/>
         </w:rPr>
       </w:pPr>
-      <w:bookmarkStart w:id="29" w:name="_Toc148467762"/>
-      <w:bookmarkStart w:id="30" w:name="_Toc221175826"/>
+      <w:bookmarkStart w:id="30" w:name="_Toc148467762"/>
+      <w:bookmarkStart w:id="31" w:name="_Toc221175826"/>
       <w:r>
         <w:rPr>
           <w:lang w:val="es-AR"/>
         </w:rPr>
         <w:t>Bibliografía:</w:t>
       </w:r>
-      <w:bookmarkEnd w:id="29"/>
       <w:bookmarkEnd w:id="30"/>
+      <w:bookmarkEnd w:id="31"/>
     </w:p>
     <w:p>
       <w:pPr>
@@ -11467,23 +11248,7 @@
           <w:rFonts w:ascii="Arial" w:hAnsi="Arial" w:cs="Arial"/>
           <w:lang w:val="es-AR"/>
         </w:rPr>
-        <w:t xml:space="preserve">Placa de desarrollo Arduino Mega 2560 </w:t>
-      </w:r>
-      <w:proofErr w:type="spellStart"/>
-      <w:r>
-        <w:rPr>
-          <w:rFonts w:ascii="Arial" w:hAnsi="Arial" w:cs="Arial"/>
-          <w:lang w:val="es-AR"/>
-        </w:rPr>
-        <w:t>datasheet</w:t>
-      </w:r>
-      <w:proofErr w:type="spellEnd"/>
-      <w:r>
-        <w:rPr>
-          <w:rFonts w:ascii="Arial" w:hAnsi="Arial" w:cs="Arial"/>
-          <w:lang w:val="es-AR"/>
-        </w:rPr>
-        <w:t>:</w:t>
+        <w:t>Placa de desarrollo Arduino Mega 2560 datasheet:</w:t>
       </w:r>
     </w:p>
     <w:p>
@@ -11513,7 +11278,6 @@
           <w:rFonts w:ascii="Arial" w:hAnsi="Arial" w:cs="Arial"/>
           <w:lang w:val="es-AR"/>
         </w:rPr>
-        <w:lastRenderedPageBreak/>
         <w:t>&lt;</w:t>
       </w:r>
       <w:hyperlink r:id="rId39" w:history="1">
@@ -11612,23 +11376,7 @@
           <w:rFonts w:ascii="Arial" w:hAnsi="Arial" w:cs="Arial"/>
           <w:lang w:val="es-AR"/>
         </w:rPr>
-        <w:t xml:space="preserve">Microcontrolador ATmega-2560 </w:t>
-      </w:r>
-      <w:proofErr w:type="spellStart"/>
-      <w:r>
-        <w:rPr>
-          <w:rFonts w:ascii="Arial" w:hAnsi="Arial" w:cs="Arial"/>
-          <w:lang w:val="es-AR"/>
-        </w:rPr>
-        <w:t>datasheet</w:t>
-      </w:r>
-      <w:proofErr w:type="spellEnd"/>
-      <w:r>
-        <w:rPr>
-          <w:rFonts w:ascii="Arial" w:hAnsi="Arial" w:cs="Arial"/>
-          <w:lang w:val="es-AR"/>
-        </w:rPr>
-        <w:t>:</w:t>
+        <w:t>Microcontrolador ATmega-2560 datasheet:</w:t>
       </w:r>
     </w:p>
     <w:p>
@@ -13325,6 +13073,16 @@
       <w:ind w:left="660"/>
     </w:pPr>
   </w:style>
+  <w:style w:type="character" w:styleId="Textodelmarcadordeposicin">
+    <w:name w:val="Placeholder Text"/>
+    <w:basedOn w:val="Fuentedeprrafopredeter"/>
+    <w:uiPriority w:val="99"/>
+    <w:semiHidden/>
+    <w:rsid w:val="00690ADD"/>
+    <w:rPr>
+      <w:color w:val="666666"/>
+    </w:rPr>
+  </w:style>
 </w:styles>
 </file>
 

</xml_diff>